<commit_message>
Renato Russo: revisão da Parte 4 (atribuições, sem falas parafraseadas, exageros)
Co-Authored-By: Claude Opus 5.5 <noreply@anthropic.com>
Claude-Session: https://claude.ai/code/session_01MJjUEEZrxQDEUifKK2vj9g
</commit_message>
<xml_diff>
--- a/roteiros/renato-russo/Renato_Parte4.docx
+++ b/roteiros/renato-russo/Renato_Parte4.docx
@@ -47,7 +47,7 @@
         <w:rPr>
           <w:color w:val="000000"/>
         </w:rPr>
-        <w:t>Guarde essa ideia. As gravações guardadas por Renato valiam muito. E, enquanto saíam pelas mãos certas, ninguém brigava por elas.</w:t>
+        <w:t>Fique com essa ideia. As gravações guardadas por Renato valiam muito. E, enquanto saíam pelas mãos certas, ninguém brigava por elas.</w:t>
       </w:r>
     </w:p>
     <w:p>
@@ -71,7 +71,7 @@
         <w:rPr>
           <w:color w:val="000000"/>
         </w:rPr>
-        <w:t>E, de uma hora para outra, aquele menino virou o único herdeiro de um dos artistas mais lucrativos do Brasil. Os direitos das músicas, os imóveis e a empresa que Renato tinha criado. Tudo passava a ser dele.</w:t>
+        <w:t>E, de uma hora para outra, aquele menino virou o único herdeiro de um dos artistas mais tocados do Brasil. Os direitos das músicas e a empresa que Renato tinha criado passavam a ser dele.</w:t>
       </w:r>
     </w:p>
     <w:p>
@@ -191,7 +191,7 @@
         <w:rPr>
           <w:color w:val="000000"/>
         </w:rPr>
-        <w:t>E ela transformou a dor em trabalho. A mulher que descobriu a doença do filho pela televisão passou a se dedicar a causas ligadas ao HIV. Anos depois, chegou a participar do lançamento de uma frente no Congresso contra o vírus, ao lado da mãe de Cazuza.</w:t>
+        <w:t>E ela transformou a dor em trabalho. A mulher que descobriu a doença do filho pela televisão passou a se dedicar a causas ligadas ao HIV. Anos depois, ela e a mãe de Cazuza foram anunciadas juntas no lançamento de uma frente no Congresso contra o vírus.</w:t>
       </w:r>
     </w:p>
     <w:p>
@@ -231,7 +231,7 @@
         <w:rPr>
           <w:color w:val="000000"/>
         </w:rPr>
-        <w:t>Agora preste atenção nela, porque o resto desta história gira em volta dessa empresa.</w:t>
+        <w:t>É em volta dela que gira todo o resto desta história.</w:t>
       </w:r>
     </w:p>
     <w:p>
@@ -295,7 +295,7 @@
         <w:rPr>
           <w:color w:val="C00000"/>
         </w:rPr>
-        <w:t>Mas a briga que ia deixar o Brasil inteiro de boca aberta ainda estava por vir. E ela envolvia os dois homens que tinham dividido o palco com Renato por mais de dez anos. Os mesmos dois que eu pedi para você guardar lá no começo.</w:t>
+        <w:t>Mas a briga que ia deixar o Brasil inteiro de boca aberta ainda estava por vir. E ela envolvia os dois homens que tinham dividido o palco com Renato por mais de dez anos. Os mesmos dois que apareceram lá no começo desta história.</w:t>
       </w:r>
     </w:p>
     <w:p>
@@ -319,7 +319,7 @@
         <w:rPr>
           <w:color w:val="000000"/>
         </w:rPr>
-        <w:t>Em dois mil e doze, os dois voltaram a tocar o repertório da banda num especial de televisão. Quem cantava era o ator Wagner Moura. Foram duas noites numa casa de shows em São Paulo, com sete mil pessoas cantando junto, como se Renato ainda estivesse ali.</w:t>
+        <w:t>Em dois mil e doze, os dois voltaram a tocar o repertório da banda num especial de televisão. Quem cantava era o ator Wagner Moura. Foram duas noites numa casa de shows em São Paulo, com o público cantando junto, como se Renato ainda estivesse ali.</w:t>
       </w:r>
     </w:p>
     <w:p>
@@ -327,7 +327,7 @@
         <w:rPr>
           <w:color w:val="000000"/>
         </w:rPr>
-        <w:t>Foi a partir daí que a tensão com o herdeiro cresceu.</w:t>
+        <w:t>Pouco tempo depois, a tensão com o herdeiro cresceu.</w:t>
       </w:r>
     </w:p>
     <w:p>
@@ -335,7 +335,7 @@
         <w:rPr>
           <w:color w:val="000000"/>
         </w:rPr>
-        <w:t>Segundo os próprios músicos, Giuliano passou a mandar notificações questionando o uso do nome Legião Urbana.</w:t>
+        <w:t>Segundo reportagens, Giuliano passou a mandar notificações questionando o uso do nome Legião Urbana.</w:t>
       </w:r>
     </w:p>
     <w:p>
@@ -479,15 +479,7 @@
         <w:rPr>
           <w:color w:val="000000"/>
         </w:rPr>
-        <w:t>A empresa de Giuliano reagiu. Disse que a decisão colocava em risco a segurança jurídica dos registros de marca no Brasil. E prometeu recorrer.</w:t>
-      </w:r>
-    </w:p>
-    <w:p>
-      <w:r>
-        <w:rPr>
-          <w:color w:val="000000"/>
-        </w:rPr>
-        <w:t>Dado comemorou. Segundo ele, os dois nunca tinham usado a marca para outra coisa além de celebrar os aniversários dos discos.</w:t>
+        <w:t>Para a empresa de Giuliano, a decisão colocava em risco a segurança jurídica dos registros de marca no Brasil. A empresa anunciou que ia recorrer.</w:t>
       </w:r>
     </w:p>
     <w:p>
@@ -591,7 +583,7 @@
         <w:rPr>
           <w:color w:val="000000"/>
         </w:rPr>
-        <w:t>Artistas que participaram do projeto reagiram com revolta. O público que esperava pelos vinte e cinco anos ficou sem nada.</w:t>
+        <w:t>Artistas que participaram do projeto reagiram com revolta. O público que esperava pelos vinte e cinco anos ficou sem a homenagem.</w:t>
       </w:r>
     </w:p>
     <w:p>
@@ -599,7 +591,7 @@
         <w:rPr>
           <w:color w:val="C00000"/>
         </w:rPr>
-        <w:t>Pense no que isso significa. Num mesmo ano, o filho perdeu na Justiça o controle do nome da banda. E a empresa dele proibiu a maior homenagem já preparada para o pai. O legado de Renato estava sendo puxado para dois lados ao mesmo tempo.</w:t>
+        <w:t>Pense no que isso significa. Num mesmo ano, o filho perdeu na Justiça o controle do nome da banda. E a empresa dele barrou a homenagem preparada para os vinte e cinco anos da morte do pai. O legado de Renato estava sendo puxado para dois lados ao mesmo tempo.</w:t>
       </w:r>
     </w:p>
     <w:p>
@@ -639,7 +631,7 @@
         <w:rPr>
           <w:color w:val="000000"/>
         </w:rPr>
-        <w:t>A Legião Urbana existiu por pouco mais de treze anos. A briga em volta dela já durou mais tempo do que a própria banda.</w:t>
+        <w:t>A Legião Urbana existiu por cerca de catorze anos. As brigas na Justiça em volta do legado de Renato começaram poucos meses depois da morte dele. E chegaram aos trinta anos sem um ponto final.</w:t>
       </w:r>
     </w:p>
     <w:p>

</xml_diff>